<commit_message>
Retarget AIAD to Palantir Maven; add S2SS AIAD, current advisor, clearance, and CQPA
Co-Authored-By: Claude Opus 5.5 <noreply@anthropic.com>
Claude-Session: https://claude.ai/code/session_01HUa9sxRc7o7bsnuzSz3H5S
</commit_message>
<xml_diff>
--- a/application/Pezan_CV_DRAFT.docx
+++ b/application/Pezan_CV_DRAFT.docx
@@ -132,25 +132,20 @@
           <w:sz w:val="22"/>
           <w:szCs w:val="22"/>
         </w:rPr>
-        <w:t xml:space="preserve">- Cumulative GPA: 3.55/4.00 </w:t>
-      </w:r>
-      <w:r>
-        <w:rPr>
-          <w:rFonts w:ascii="Times New Roman" w:cs="Times New Roman" w:eastAsia="Times New Roman" w:hAnsi="Times New Roman"/>
-          <w:sz w:val="22"/>
-          <w:szCs w:val="22"/>
-          <w:highlight w:val="yellow"/>
-          <w:highlightCs w:val="yellow"/>
-        </w:rPr>
-        <w:t xml:space="preserve">[confirm current CQPA]</w:t>
-      </w:r>
-      <w:r>
-        <w:rPr>
-          <w:rFonts w:ascii="Times New Roman" w:cs="Times New Roman" w:eastAsia="Times New Roman" w:hAnsi="Times New Roman"/>
-          <w:sz w:val="22"/>
-          <w:szCs w:val="22"/>
-        </w:rPr>
-        <w:t xml:space="preserve">; Stokes Writing Fellow</w:t>
+        <w:t xml:space="preserve">- Cumulative GPA: 3.571/4.00; Stokes Writing Fellow</w:t>
+      </w:r>
+    </w:p>
+    <w:p>
+      <w:pPr>
+        <w:ind w:left="2340" w:hanging="180"/>
+      </w:pPr>
+      <w:r>
+        <w:rPr>
+          <w:rFonts w:ascii="Times New Roman" w:cs="Times New Roman" w:eastAsia="Times New Roman" w:hAnsi="Times New Roman"/>
+          <w:sz w:val="22"/>
+          <w:szCs w:val="22"/>
+        </w:rPr>
+        <w:t xml:space="preserve">- Security clearance: Secret</w:t>
       </w:r>
     </w:p>
     <w:p>
@@ -199,102 +194,50 @@
           <w:sz w:val="22"/>
           <w:szCs w:val="22"/>
         </w:rPr>
-        <w:t xml:space="preserve">Jun–Jul 2026</w:t>
-      </w:r>
-      <w:r>
-        <w:rPr>
-          <w:rFonts w:ascii="Times New Roman" w:cs="Times New Roman" w:eastAsia="Times New Roman" w:hAnsi="Times New Roman"/>
-        </w:rPr>
-        <w:t xml:space="preserve">	</w:t>
-      </w:r>
-      <w:r>
-        <w:rPr>
-          <w:rFonts w:ascii="Times New Roman" w:cs="Times New Roman" w:eastAsia="Times New Roman" w:hAnsi="Times New Roman"/>
-          <w:b/>
-          <w:bCs/>
-          <w:sz w:val="22"/>
-          <w:szCs w:val="22"/>
-        </w:rPr>
-        <w:t xml:space="preserve">AI Research Intern, Transformation Decision Analysis Center</w:t>
-      </w:r>
-      <w:r>
-        <w:rPr>
-          <w:rFonts w:ascii="Times New Roman" w:cs="Times New Roman" w:eastAsia="Times New Roman" w:hAnsi="Times New Roman"/>
-        </w:rPr>
-        <w:t xml:space="preserve">	</w:t>
-      </w:r>
-      <w:r>
-        <w:rPr>
-          <w:rFonts w:ascii="Times New Roman" w:cs="Times New Roman" w:eastAsia="Times New Roman" w:hAnsi="Times New Roman"/>
-          <w:sz w:val="22"/>
-          <w:szCs w:val="22"/>
-        </w:rPr>
-        <w:t xml:space="preserve">Fort Lee, VA</w:t>
-      </w:r>
-    </w:p>
-    <w:p>
-      <w:pPr>
-        <w:ind w:left="2340" w:hanging="180"/>
-      </w:pPr>
-      <w:r>
-        <w:rPr>
-          <w:rFonts w:ascii="Times New Roman" w:cs="Times New Roman" w:eastAsia="Times New Roman" w:hAnsi="Times New Roman"/>
-          <w:sz w:val="22"/>
-          <w:szCs w:val="22"/>
-        </w:rPr>
-        <w:t xml:space="preserve">- Academic Individual Advanced Development (AIAD) summer internship; mentor: MAJ Erica Mikelson</w:t>
-      </w:r>
-    </w:p>
-    <w:p>
-      <w:pPr>
-        <w:ind w:left="2340" w:hanging="180"/>
-      </w:pPr>
-      <w:r>
-        <w:rPr>
-          <w:rFonts w:ascii="Times New Roman" w:cs="Times New Roman" w:eastAsia="Times New Roman" w:hAnsi="Times New Roman"/>
-          <w:sz w:val="22"/>
-          <w:szCs w:val="22"/>
-        </w:rPr>
-        <w:t xml:space="preserve">- Redesigned the reward function for a proximal policy optimization (PPO) reinforcement-learning agent that allocates resupply in Logistics Battle Command, the Army’s stochastic sustainment simulation (Python implementation)</w:t>
-      </w:r>
-    </w:p>
-    <w:p>
-      <w:pPr>
-        <w:ind w:left="2340" w:hanging="180"/>
-      </w:pPr>
-      <w:r>
-        <w:rPr>
-          <w:rFonts w:ascii="Times New Roman" w:cs="Times New Roman" w:eastAsia="Times New Roman" w:hAnsi="Times New Roman"/>
-          <w:sz w:val="22"/>
-          <w:szCs w:val="22"/>
-        </w:rPr>
-        <w:t xml:space="preserve">- Built two diagnostic tools that exposed four reward flaws, including an agent that outscored every baseline while starving the priority unit during engagements</w:t>
-      </w:r>
-    </w:p>
-    <w:p>
-      <w:pPr>
-        <w:ind w:left="2340" w:hanging="180"/>
-      </w:pPr>
-      <w:r>
-        <w:rPr>
-          <w:rFonts w:ascii="Times New Roman" w:cs="Times New Roman" w:eastAsia="Times New Roman" w:hAnsi="Times New Roman"/>
-          <w:sz w:val="22"/>
-          <w:szCs w:val="22"/>
-        </w:rPr>
-        <w:t xml:space="preserve">- Retrained agent more than tripled the share of requests filled and outperformed a hand-coded priority-aware baseline across 101 random seeds</w:t>
-      </w:r>
-    </w:p>
-    <w:p>
-      <w:pPr>
-        <w:ind w:left="2340" w:hanging="180"/>
-      </w:pPr>
-      <w:r>
-        <w:rPr>
-          <w:rFonts w:ascii="Times New Roman" w:cs="Times New Roman" w:eastAsia="Times New Roman" w:hAnsi="Times New Roman"/>
-          <w:sz w:val="22"/>
-          <w:szCs w:val="22"/>
-        </w:rPr>
-        <w:t xml:space="preserve">- Met with Palantir </w:t>
+        <w:t xml:space="preserve">Aug 2026–Present</w:t>
+      </w:r>
+      <w:r>
+        <w:rPr>
+          <w:rFonts w:ascii="Times New Roman" w:cs="Times New Roman" w:eastAsia="Times New Roman" w:hAnsi="Times New Roman"/>
+        </w:rPr>
+        <w:t xml:space="preserve">	</w:t>
+      </w:r>
+      <w:r>
+        <w:rPr>
+          <w:rFonts w:ascii="Times New Roman" w:cs="Times New Roman" w:eastAsia="Times New Roman" w:hAnsi="Times New Roman"/>
+          <w:b/>
+          <w:bCs/>
+          <w:sz w:val="22"/>
+          <w:szCs w:val="22"/>
+        </w:rPr>
+        <w:t xml:space="preserve">Undergraduate Researcher, Military Logistics</w:t>
+      </w:r>
+      <w:r>
+        <w:rPr>
+          <w:rFonts w:ascii="Times New Roman" w:cs="Times New Roman" w:eastAsia="Times New Roman" w:hAnsi="Times New Roman"/>
+        </w:rPr>
+        <w:t xml:space="preserve">	</w:t>
+      </w:r>
+      <w:r>
+        <w:rPr>
+          <w:rFonts w:ascii="Times New Roman" w:cs="Times New Roman" w:eastAsia="Times New Roman" w:hAnsi="Times New Roman"/>
+          <w:sz w:val="22"/>
+          <w:szCs w:val="22"/>
+        </w:rPr>
+        <w:t xml:space="preserve">West Point, NY</w:t>
+      </w:r>
+    </w:p>
+    <w:p>
+      <w:pPr>
+        <w:ind w:left="2340" w:hanging="180"/>
+      </w:pPr>
+      <w:r>
+        <w:rPr>
+          <w:rFonts w:ascii="Times New Roman" w:cs="Times New Roman" w:eastAsia="Times New Roman" w:hAnsi="Times New Roman"/>
+          <w:sz w:val="22"/>
+          <w:szCs w:val="22"/>
+        </w:rPr>
+        <w:t xml:space="preserve">- Advisor: LTC Webb; </w:t>
       </w:r>
       <w:r>
         <w:rPr>
@@ -304,7 +247,7 @@
           <w:highlight w:val="yellow"/>
           <w:highlightCs w:val="yellow"/>
         </w:rPr>
-        <w:t xml:space="preserve">[details of the meeting]</w:t>
+        <w:t xml:space="preserve">[one line on the MIT logistics project]</w:t>
       </w:r>
     </w:p>
     <w:p>
@@ -322,7 +265,167 @@
           <w:sz w:val="22"/>
           <w:szCs w:val="22"/>
         </w:rPr>
-        <w:t xml:space="preserve">2025–Present</w:t>
+        <w:t xml:space="preserve">Jun–Jul 2026</w:t>
+      </w:r>
+      <w:r>
+        <w:rPr>
+          <w:rFonts w:ascii="Times New Roman" w:cs="Times New Roman" w:eastAsia="Times New Roman" w:hAnsi="Times New Roman"/>
+        </w:rPr>
+        <w:t xml:space="preserve">	</w:t>
+      </w:r>
+      <w:r>
+        <w:rPr>
+          <w:rFonts w:ascii="Times New Roman" w:cs="Times New Roman" w:eastAsia="Times New Roman" w:hAnsi="Times New Roman"/>
+          <w:b/>
+          <w:bCs/>
+          <w:sz w:val="22"/>
+          <w:szCs w:val="22"/>
+        </w:rPr>
+        <w:t xml:space="preserve">AI Research Intern, Transformation Decision Analysis Center</w:t>
+      </w:r>
+      <w:r>
+        <w:rPr>
+          <w:rFonts w:ascii="Times New Roman" w:cs="Times New Roman" w:eastAsia="Times New Roman" w:hAnsi="Times New Roman"/>
+        </w:rPr>
+        <w:t xml:space="preserve">	</w:t>
+      </w:r>
+      <w:r>
+        <w:rPr>
+          <w:rFonts w:ascii="Times New Roman" w:cs="Times New Roman" w:eastAsia="Times New Roman" w:hAnsi="Times New Roman"/>
+          <w:sz w:val="22"/>
+          <w:szCs w:val="22"/>
+        </w:rPr>
+        <w:t xml:space="preserve">Fort Lee, VA</w:t>
+      </w:r>
+    </w:p>
+    <w:p>
+      <w:pPr>
+        <w:ind w:left="2340" w:hanging="180"/>
+      </w:pPr>
+      <w:r>
+        <w:rPr>
+          <w:rFonts w:ascii="Times New Roman" w:cs="Times New Roman" w:eastAsia="Times New Roman" w:hAnsi="Times New Roman"/>
+          <w:sz w:val="22"/>
+          <w:szCs w:val="22"/>
+        </w:rPr>
+        <w:t xml:space="preserve">- Academic Individual Advanced Development (AIAD) summer internship; mentor: MAJ Erica Mikelson</w:t>
+      </w:r>
+    </w:p>
+    <w:p>
+      <w:pPr>
+        <w:ind w:left="2340" w:hanging="180"/>
+      </w:pPr>
+      <w:r>
+        <w:rPr>
+          <w:rFonts w:ascii="Times New Roman" w:cs="Times New Roman" w:eastAsia="Times New Roman" w:hAnsi="Times New Roman"/>
+          <w:sz w:val="22"/>
+          <w:szCs w:val="22"/>
+        </w:rPr>
+        <w:t xml:space="preserve">- Redesigned the reward function for a proximal policy optimization (PPO) reinforcement-learning agent that allocates resupply in Logistics Battle Command, the Army’s stochastic sustainment simulation (Python implementation)</w:t>
+      </w:r>
+    </w:p>
+    <w:p>
+      <w:pPr>
+        <w:ind w:left="2340" w:hanging="180"/>
+      </w:pPr>
+      <w:r>
+        <w:rPr>
+          <w:rFonts w:ascii="Times New Roman" w:cs="Times New Roman" w:eastAsia="Times New Roman" w:hAnsi="Times New Roman"/>
+          <w:sz w:val="22"/>
+          <w:szCs w:val="22"/>
+        </w:rPr>
+        <w:t xml:space="preserve">- Built two diagnostic tools that exposed four reward flaws, including an agent that outscored every baseline while starving the priority unit during engagements</w:t>
+      </w:r>
+    </w:p>
+    <w:p>
+      <w:pPr>
+        <w:ind w:left="2340" w:hanging="180"/>
+      </w:pPr>
+      <w:r>
+        <w:rPr>
+          <w:rFonts w:ascii="Times New Roman" w:cs="Times New Roman" w:eastAsia="Times New Roman" w:hAnsi="Times New Roman"/>
+          <w:sz w:val="22"/>
+          <w:szCs w:val="22"/>
+        </w:rPr>
+        <w:t xml:space="preserve">- Retrained agent more than tripled the share of requests filled and outperformed a hand-coded priority-aware baseline across 101 random seeds</w:t>
+      </w:r>
+    </w:p>
+    <w:p>
+      <w:pPr>
+        <w:tabs>
+          <w:tab w:val="left" w:pos="2160"/>
+          <w:tab w:val="right" w:pos="9360"/>
+        </w:tabs>
+        <w:spacing w:before="60"/>
+        <w:ind w:left="2160" w:hanging="2160"/>
+      </w:pPr>
+      <w:r>
+        <w:rPr>
+          <w:rFonts w:ascii="Times New Roman" w:cs="Times New Roman" w:eastAsia="Times New Roman" w:hAnsi="Times New Roman"/>
+          <w:sz w:val="22"/>
+          <w:szCs w:val="22"/>
+        </w:rPr>
+        <w:t xml:space="preserve">Summer 2026</w:t>
+      </w:r>
+      <w:r>
+        <w:rPr>
+          <w:rFonts w:ascii="Times New Roman" w:cs="Times New Roman" w:eastAsia="Times New Roman" w:hAnsi="Times New Roman"/>
+        </w:rPr>
+        <w:t xml:space="preserve">	</w:t>
+      </w:r>
+      <w:r>
+        <w:rPr>
+          <w:rFonts w:ascii="Times New Roman" w:cs="Times New Roman" w:eastAsia="Times New Roman" w:hAnsi="Times New Roman"/>
+          <w:b/>
+          <w:bCs/>
+          <w:sz w:val="22"/>
+          <w:szCs w:val="22"/>
+        </w:rPr>
+        <w:t xml:space="preserve">Sea to Shining Sea Domestic AIAD (Defense Technology and Innovation)</w:t>
+      </w:r>
+    </w:p>
+    <w:p>
+      <w:pPr>
+        <w:ind w:left="2340" w:hanging="180"/>
+      </w:pPr>
+      <w:r>
+        <w:rPr>
+          <w:rFonts w:ascii="Times New Roman" w:cs="Times New Roman" w:eastAsia="Times New Roman" w:hAnsi="Times New Roman"/>
+          <w:sz w:val="22"/>
+          <w:szCs w:val="22"/>
+        </w:rPr>
+        <w:t xml:space="preserve">- Engaged Palantir (Project Maven demonstration), Stanford’s Gordian Knot Center (Col. (Ret.) Joseph Felter, Jack Faherty), OpenAI, Apple, and Meta Reality Labs (CTO Andrew Bosworth) on how defense technology is developed and procured</w:t>
+      </w:r>
+    </w:p>
+    <w:p>
+      <w:pPr>
+        <w:ind w:left="2340" w:hanging="180"/>
+      </w:pPr>
+      <w:r>
+        <w:rPr>
+          <w:rFonts w:ascii="Times New Roman" w:cs="Times New Roman" w:eastAsia="Times New Roman" w:hAnsi="Times New Roman"/>
+          <w:sz w:val="22"/>
+          <w:szCs w:val="22"/>
+        </w:rPr>
+        <w:t xml:space="preserve">- Observed how the 4th Infantry Division employs and gives feedback on these systems under Next Generation Command and Control; visited U.S. Northern Command and NORAD</w:t>
+      </w:r>
+    </w:p>
+    <w:p>
+      <w:pPr>
+        <w:tabs>
+          <w:tab w:val="left" w:pos="2160"/>
+          <w:tab w:val="right" w:pos="9360"/>
+        </w:tabs>
+        <w:spacing w:before="60"/>
+        <w:ind w:left="2160" w:hanging="2160"/>
+      </w:pPr>
+      <w:r>
+        <w:rPr>
+          <w:rFonts w:ascii="Times New Roman" w:cs="Times New Roman" w:eastAsia="Times New Roman" w:hAnsi="Times New Roman"/>
+          <w:sz w:val="22"/>
+          <w:szCs w:val="22"/>
+        </w:rPr>
+        <w:t xml:space="preserve">Aug 2025–May 2026</w:t>
       </w:r>
       <w:r>
         <w:rPr>

</xml_diff>

<commit_message>
Add Taiwan crude oil interdiction project with LTC Webb to memo and CV
Co-Authored-By: Claude Opus 5.5 <noreply@anthropic.com>
Claude-Session: https://claude.ai/code/session_01HUa9sxRc7o7bsnuzSz3H5S
</commit_message>
<xml_diff>
--- a/application/Pezan_CV_DRAFT.docx
+++ b/application/Pezan_CV_DRAFT.docx
@@ -158,7 +158,7 @@
           <w:sz w:val="22"/>
           <w:szCs w:val="22"/>
         </w:rPr>
-        <w:t xml:space="preserve">- Research interests: reinforcement learning for military logistics; objective-function and reward design; learning-augmented optimization; decision support under uncertainty</w:t>
+        <w:t xml:space="preserve">- Research interests: network interdiction and contested logistics; reinforcement learning; objective-function and reward design; optimization for decision support</w:t>
       </w:r>
     </w:p>
     <w:p>
@@ -210,7 +210,7 @@
           <w:sz w:val="22"/>
           <w:szCs w:val="22"/>
         </w:rPr>
-        <w:t xml:space="preserve">Undergraduate Researcher, Military Logistics</w:t>
+        <w:t xml:space="preserve">Undergraduate Researcher, Threat-Adaptive Interdiction of Taiwan’s Crude Oil Supply (MA289)</w:t>
       </w:r>
       <w:r>
         <w:rPr>
@@ -237,17 +237,59 @@
           <w:sz w:val="22"/>
           <w:szCs w:val="22"/>
         </w:rPr>
-        <w:t xml:space="preserve">- Advisor: LTC Webb; </w:t>
-      </w:r>
-      <w:r>
-        <w:rPr>
-          <w:rFonts w:ascii="Times New Roman" w:cs="Times New Roman" w:eastAsia="Times New Roman" w:hAnsi="Times New Roman"/>
-          <w:sz w:val="22"/>
-          <w:szCs w:val="22"/>
-          <w:highlight w:val="yellow"/>
-          <w:highlightCs w:val="yellow"/>
-        </w:rPr>
-        <w:t xml:space="preserve">[one line on the MIT logistics project]</w:t>
+        <w:t xml:space="preserve">- Advisor: LTC Matthew Webb; part of his contested-logistics research partnered with the MIT Center for Transportation &amp; Logistics</w:t>
+      </w:r>
+    </w:p>
+    <w:p>
+      <w:pPr>
+        <w:ind w:left="2340" w:hanging="180"/>
+      </w:pPr>
+      <w:r>
+        <w:rPr>
+          <w:rFonts w:ascii="Times New Roman" w:cs="Times New Roman" w:eastAsia="Times New Roman" w:hAnsi="Times New Roman"/>
+          <w:sz w:val="22"/>
+          <w:szCs w:val="22"/>
+        </w:rPr>
+        <w:t xml:space="preserve">- Built a 57-node, 79-edge open-source model of Taiwan’s crude oil import network (four sources, major straits and canals, three ports) with sourced capacities</w:t>
+      </w:r>
+    </w:p>
+    <w:p>
+      <w:pPr>
+        <w:ind w:left="2340" w:hanging="180"/>
+      </w:pPr>
+      <w:r>
+        <w:rPr>
+          <w:rFonts w:ascii="Times New Roman" w:cs="Times New Roman" w:eastAsia="Times New Roman" w:hAnsi="Times New Roman"/>
+          <w:sz w:val="22"/>
+          <w:szCs w:val="22"/>
+        </w:rPr>
+        <w:t xml:space="preserve">- Designed a fixed-budget adversary action set: seven action types with costs and success probabilities anchored on historical events</w:t>
+      </w:r>
+    </w:p>
+    <w:p>
+      <w:pPr>
+        <w:ind w:left="2340" w:hanging="180"/>
+      </w:pPr>
+      <w:r>
+        <w:rPr>
+          <w:rFonts w:ascii="Times New Roman" w:cs="Times New Roman" w:eastAsia="Times New Roman" w:hAnsi="Times New Roman"/>
+          <w:sz w:val="22"/>
+          <w:szCs w:val="22"/>
+        </w:rPr>
+        <w:t xml:space="preserve">- Connected the network to a reinforcement-learning interdiction environment and verified it against an independent max-flow calculation; found and fixed a targeting-filter issue that could hide the Strait of Hormuz</w:t>
+      </w:r>
+    </w:p>
+    <w:p>
+      <w:pPr>
+        <w:ind w:left="2340" w:hanging="180"/>
+      </w:pPr>
+      <w:r>
+        <w:rPr>
+          <w:rFonts w:ascii="Times New Roman" w:cs="Times New Roman" w:eastAsia="Times New Roman" w:hAnsi="Times New Roman"/>
+          <w:sz w:val="22"/>
+          <w:szCs w:val="22"/>
+        </w:rPr>
+        <w:t xml:space="preserve">- Next: compare optimization baselines with the trained attacker (MIT SuperCloud) and test transfer from rail to maritime networks</w:t>
       </w:r>
     </w:p>
     <w:p>

</xml_diff>

<commit_message>
Swap conference to MORS Symposium; cite Webb's interdiction research; adopt his presentation citation format
Co-Authored-By: Claude Opus 5.5 <noreply@anthropic.com>
Claude-Session: https://claude.ai/code/session_01HUa9sxRc7o7bsnuzSz3H5S
</commit_message>
<xml_diff>
--- a/application/Pezan_CV_DRAFT.docx
+++ b/application/Pezan_CV_DRAFT.docx
@@ -237,7 +237,7 @@
           <w:sz w:val="22"/>
           <w:szCs w:val="22"/>
         </w:rPr>
-        <w:t xml:space="preserve">- Advisor: LTC Matthew Webb; part of his contested-logistics research partnered with the MIT Center for Transportation &amp; Logistics</w:t>
+        <w:t xml:space="preserve">- Advisor: LTC Matthew Webb; extends his MIT Center for Transportation &amp; Logistics doctoral research on reinforcement learning for maximum-flow network interdiction</w:t>
       </w:r>
     </w:p>
     <w:p>
@@ -582,15 +582,15 @@
           <w:sz w:val="22"/>
           <w:szCs w:val="22"/>
         </w:rPr>
-        <w:t xml:space="preserve">D. Pezan</w:t>
-      </w:r>
-      <w:r>
-        <w:rPr>
-          <w:rFonts w:ascii="Times New Roman" w:cs="Times New Roman" w:eastAsia="Times New Roman" w:hAnsi="Times New Roman"/>
-          <w:sz w:val="22"/>
-          <w:szCs w:val="22"/>
-        </w:rPr>
-        <w:t xml:space="preserve">, “Reward Design for RL Resupply in Logistics Battle Command,” final results brief to TDAC leadership, Fort Lee, VA, Jul. 2026.</w:t>
+        <w:t xml:space="preserve">Pezan D</w:t>
+      </w:r>
+      <w:r>
+        <w:rPr>
+          <w:rFonts w:ascii="Times New Roman" w:cs="Times New Roman" w:eastAsia="Times New Roman" w:hAnsi="Times New Roman"/>
+          <w:sz w:val="22"/>
+          <w:szCs w:val="22"/>
+        </w:rPr>
+        <w:t xml:space="preserve"> (2026). Reward Design for Reinforcement-Learning Resupply in Logistics Battle Command. Final results brief, Transformation Decision Analysis Center. Fort Lee, VA, July 22.</w:t>
       </w:r>
     </w:p>
     <w:p>

</xml_diff>

<commit_message>
Retitle Kuiper work as Independent Study in Machine Learning
Co-Authored-By: Claude Opus 5.5 <noreply@anthropic.com>
Claude-Session: https://claude.ai/code/session_01HUa9sxRc7o7bsnuzSz3H5S
</commit_message>
<xml_diff>
--- a/application/Pezan_CV_DRAFT.docx
+++ b/application/Pezan_CV_DRAFT.docx
@@ -483,7 +483,7 @@
           <w:sz w:val="22"/>
           <w:szCs w:val="22"/>
         </w:rPr>
-        <w:t xml:space="preserve">Undergraduate Research Assistant, Applied AI Research</w:t>
+        <w:t xml:space="preserve">Independent Study in Machine Learning</w:t>
       </w:r>
       <w:r>
         <w:rPr>
@@ -523,7 +523,7 @@
           <w:sz w:val="22"/>
           <w:szCs w:val="22"/>
         </w:rPr>
-        <w:t xml:space="preserve">- Applied machine-learning research on model behavior, bagging, and random forests for data-driven decision making</w:t>
+        <w:t xml:space="preserve">- Designed and completed an independent study of decision trees, bagging, and random forests (MA289), and presented the findings</w:t>
       </w:r>
     </w:p>
     <w:p>

</xml_diff>

<commit_message>
Replace coding-demo line with 'presented findings to officers'
Co-Authored-By: Claude Opus 5.5 <noreply@anthropic.com>
Claude-Session: https://claude.ai/code/session_01HUa9sxRc7o7bsnuzSz3H5S
</commit_message>
<xml_diff>
--- a/application/Pezan_CV_DRAFT.docx
+++ b/application/Pezan_CV_DRAFT.docx
@@ -523,7 +523,7 @@
           <w:sz w:val="22"/>
           <w:szCs w:val="22"/>
         </w:rPr>
-        <w:t xml:space="preserve">- Designed and completed an independent study of decision trees, bagging, and random forests (MA289), and presented the findings</w:t>
+        <w:t xml:space="preserve">- Designed and completed an independent study of decision trees, bagging, and random forests (MA289), and presented the findings to officers</w:t>
       </w:r>
     </w:p>
     <w:p>
@@ -537,19 +537,6 @@
           <w:szCs w:val="22"/>
         </w:rPr>
         <w:t xml:space="preserve">- Built an interactive random forest research site (MA289) with a live classifier demo and a hyperparameter explorer</w:t>
-      </w:r>
-    </w:p>
-    <w:p>
-      <w:pPr>
-        <w:ind w:left="2340" w:hanging="180"/>
-      </w:pPr>
-      <w:r>
-        <w:rPr>
-          <w:rFonts w:ascii="Times New Roman" w:cs="Times New Roman" w:eastAsia="Times New Roman" w:hAnsi="Times New Roman"/>
-          <w:sz w:val="22"/>
-          <w:szCs w:val="22"/>
-        </w:rPr>
-        <w:t xml:space="preserve">- Delivered a live AI-assisted coding demonstration of machine-learning workflows to deployed Army officers</w:t>
       </w:r>
     </w:p>
     <w:p>

</xml_diff>